<commit_message>
Clarify docx_gen_prompt rules and refresh wisdom-tooth template samples
Prevents the LLM from leaving narrative fields (жалобы/анамнез/осмотр/лечение)
blank when the diagnosis text is terse, and updates the sample template
docs to match.
</commit_message>
<xml_diff>
--- a/data/history_of_illness/medical_card_wisdom_tooth.docx
+++ b/data/history_of_illness/medical_card_wisdom_tooth.docx
@@ -806,7 +806,7 @@
     </w:p>
     <w:tbl>
       <w:tblPr>
-        <w:tblW w:w="9360" w:type="dxa"/>
+        <w:tblW w:w="9342" w:type="dxa"/>
         <w:jc w:val="center"/>
         <w:tblBorders>
           <w:top w:val="single" w:sz="4" w:space="0" w:color="000000"/>
@@ -837,30 +837,222 @@
         <w:gridCol w:w="585"/>
         <w:gridCol w:w="585"/>
         <w:gridCol w:w="585"/>
-        <w:gridCol w:w="585"/>
+        <w:gridCol w:w="567"/>
         <w:gridCol w:w="585"/>
       </w:tblGrid>
       <w:tr>
         <w:trPr>
+          <w:trHeight w:val="340"/>
           <w:jc w:val="center"/>
         </w:trPr>
         <w:tc>
           <w:tcPr>
-            <w:tcW w:w="4680" w:type="dxa"/>
-            <w:gridSpan w:val="8"/>
-          </w:tcPr>
-          <w:p>
-            <w:pPr>
-              <w:jc w:val="center"/>
-            </w:pPr>
-          </w:p>
-        </w:tc>
-        <w:tc>
-          <w:tcPr>
-            <w:tcW w:w="4680" w:type="dxa"/>
-            <w:gridSpan w:val="8"/>
+            <w:tcW w:w="585" w:type="dxa"/>
+            <w:tcBorders>
+              <w:right w:val="single" w:sz="4" w:space="0" w:color="auto"/>
+            </w:tcBorders>
+          </w:tcPr>
+          <w:p>
+            <w:pPr>
+              <w:jc w:val="center"/>
+            </w:pPr>
+          </w:p>
+        </w:tc>
+        <w:tc>
+          <w:tcPr>
+            <w:tcW w:w="585" w:type="dxa"/>
+            <w:tcBorders>
+              <w:right w:val="single" w:sz="4" w:space="0" w:color="auto"/>
+            </w:tcBorders>
+          </w:tcPr>
+          <w:p>
+            <w:pPr>
+              <w:jc w:val="center"/>
+            </w:pPr>
+          </w:p>
+        </w:tc>
+        <w:tc>
+          <w:tcPr>
+            <w:tcW w:w="585" w:type="dxa"/>
+            <w:tcBorders>
+              <w:right w:val="single" w:sz="4" w:space="0" w:color="auto"/>
+            </w:tcBorders>
+          </w:tcPr>
+          <w:p>
+            <w:pPr>
+              <w:jc w:val="center"/>
+            </w:pPr>
+          </w:p>
+        </w:tc>
+        <w:tc>
+          <w:tcPr>
+            <w:tcW w:w="585" w:type="dxa"/>
+            <w:tcBorders>
+              <w:right w:val="single" w:sz="4" w:space="0" w:color="auto"/>
+            </w:tcBorders>
+          </w:tcPr>
+          <w:p>
+            <w:pPr>
+              <w:jc w:val="center"/>
+            </w:pPr>
+          </w:p>
+        </w:tc>
+        <w:tc>
+          <w:tcPr>
+            <w:tcW w:w="585" w:type="dxa"/>
+            <w:tcBorders>
+              <w:right w:val="single" w:sz="4" w:space="0" w:color="auto"/>
+            </w:tcBorders>
+          </w:tcPr>
+          <w:p>
+            <w:pPr>
+              <w:jc w:val="center"/>
+            </w:pPr>
+          </w:p>
+        </w:tc>
+        <w:tc>
+          <w:tcPr>
+            <w:tcW w:w="585" w:type="dxa"/>
+            <w:tcBorders>
+              <w:right w:val="single" w:sz="4" w:space="0" w:color="auto"/>
+            </w:tcBorders>
+          </w:tcPr>
+          <w:p>
+            <w:pPr>
+              <w:jc w:val="center"/>
+            </w:pPr>
+          </w:p>
+        </w:tc>
+        <w:tc>
+          <w:tcPr>
+            <w:tcW w:w="585" w:type="dxa"/>
+            <w:tcBorders>
+              <w:right w:val="single" w:sz="4" w:space="0" w:color="auto"/>
+            </w:tcBorders>
+          </w:tcPr>
+          <w:p>
+            <w:pPr>
+              <w:jc w:val="center"/>
+            </w:pPr>
+          </w:p>
+        </w:tc>
+        <w:tc>
+          <w:tcPr>
+            <w:tcW w:w="585" w:type="dxa"/>
+            <w:tcBorders>
+              <w:right w:val="single" w:sz="24" w:space="0" w:color="000000"/>
+            </w:tcBorders>
+          </w:tcPr>
+          <w:p>
+            <w:pPr>
+              <w:jc w:val="center"/>
+            </w:pPr>
+          </w:p>
+        </w:tc>
+        <w:tc>
+          <w:tcPr>
+            <w:tcW w:w="585" w:type="dxa"/>
             <w:tcBorders>
               <w:left w:val="single" w:sz="24" w:space="0" w:color="000000"/>
+              <w:right w:val="single" w:sz="4" w:space="0" w:color="auto"/>
+            </w:tcBorders>
+          </w:tcPr>
+          <w:p>
+            <w:pPr>
+              <w:jc w:val="center"/>
+            </w:pPr>
+          </w:p>
+        </w:tc>
+        <w:tc>
+          <w:tcPr>
+            <w:tcW w:w="585" w:type="dxa"/>
+            <w:tcBorders>
+              <w:left w:val="single" w:sz="4" w:space="0" w:color="auto"/>
+              <w:right w:val="single" w:sz="4" w:space="0" w:color="auto"/>
+            </w:tcBorders>
+          </w:tcPr>
+          <w:p>
+            <w:pPr>
+              <w:jc w:val="center"/>
+            </w:pPr>
+          </w:p>
+        </w:tc>
+        <w:tc>
+          <w:tcPr>
+            <w:tcW w:w="585" w:type="dxa"/>
+            <w:tcBorders>
+              <w:left w:val="single" w:sz="4" w:space="0" w:color="auto"/>
+              <w:right w:val="single" w:sz="4" w:space="0" w:color="auto"/>
+            </w:tcBorders>
+          </w:tcPr>
+          <w:p>
+            <w:pPr>
+              <w:jc w:val="center"/>
+            </w:pPr>
+          </w:p>
+        </w:tc>
+        <w:tc>
+          <w:tcPr>
+            <w:tcW w:w="585" w:type="dxa"/>
+            <w:tcBorders>
+              <w:left w:val="single" w:sz="4" w:space="0" w:color="auto"/>
+              <w:right w:val="single" w:sz="4" w:space="0" w:color="auto"/>
+            </w:tcBorders>
+          </w:tcPr>
+          <w:p>
+            <w:pPr>
+              <w:jc w:val="center"/>
+            </w:pPr>
+          </w:p>
+        </w:tc>
+        <w:tc>
+          <w:tcPr>
+            <w:tcW w:w="585" w:type="dxa"/>
+            <w:tcBorders>
+              <w:left w:val="single" w:sz="4" w:space="0" w:color="auto"/>
+              <w:right w:val="single" w:sz="4" w:space="0" w:color="auto"/>
+            </w:tcBorders>
+          </w:tcPr>
+          <w:p>
+            <w:pPr>
+              <w:jc w:val="center"/>
+            </w:pPr>
+          </w:p>
+        </w:tc>
+        <w:tc>
+          <w:tcPr>
+            <w:tcW w:w="585" w:type="dxa"/>
+            <w:tcBorders>
+              <w:left w:val="single" w:sz="4" w:space="0" w:color="auto"/>
+              <w:right w:val="single" w:sz="4" w:space="0" w:color="auto"/>
+            </w:tcBorders>
+          </w:tcPr>
+          <w:p>
+            <w:pPr>
+              <w:jc w:val="center"/>
+            </w:pPr>
+          </w:p>
+        </w:tc>
+        <w:tc>
+          <w:tcPr>
+            <w:tcW w:w="567" w:type="dxa"/>
+            <w:tcBorders>
+              <w:left w:val="single" w:sz="4" w:space="0" w:color="auto"/>
+              <w:right w:val="single" w:sz="4" w:space="0" w:color="auto"/>
+            </w:tcBorders>
+          </w:tcPr>
+          <w:p>
+            <w:pPr>
+              <w:jc w:val="center"/>
+            </w:pPr>
+          </w:p>
+        </w:tc>
+        <w:tc>
+          <w:tcPr>
+            <w:tcW w:w="585" w:type="dxa"/>
+            <w:tcBorders>
+              <w:left w:val="single" w:sz="4" w:space="0" w:color="auto"/>
+              <w:right w:val="single" w:sz="4" w:space="0" w:color="auto"/>
             </w:tcBorders>
           </w:tcPr>
           <w:p>
@@ -877,6 +1069,9 @@
         <w:tc>
           <w:tcPr>
             <w:tcW w:w="585" w:type="dxa"/>
+            <w:tcBorders>
+              <w:right w:val="single" w:sz="4" w:space="0" w:color="auto"/>
+            </w:tcBorders>
           </w:tcPr>
           <w:p>
             <w:pPr>
@@ -890,6 +1085,10 @@
         <w:tc>
           <w:tcPr>
             <w:tcW w:w="585" w:type="dxa"/>
+            <w:tcBorders>
+              <w:left w:val="single" w:sz="4" w:space="0" w:color="auto"/>
+              <w:right w:val="single" w:sz="4" w:space="0" w:color="auto"/>
+            </w:tcBorders>
           </w:tcPr>
           <w:p>
             <w:pPr>
@@ -903,6 +1102,9 @@
         <w:tc>
           <w:tcPr>
             <w:tcW w:w="585" w:type="dxa"/>
+            <w:tcBorders>
+              <w:left w:val="single" w:sz="4" w:space="0" w:color="auto"/>
+            </w:tcBorders>
           </w:tcPr>
           <w:p>
             <w:pPr>
@@ -916,6 +1118,9 @@
         <w:tc>
           <w:tcPr>
             <w:tcW w:w="585" w:type="dxa"/>
+            <w:tcBorders>
+              <w:right w:val="single" w:sz="4" w:space="0" w:color="auto"/>
+            </w:tcBorders>
           </w:tcPr>
           <w:p>
             <w:pPr>
@@ -929,6 +1134,10 @@
         <w:tc>
           <w:tcPr>
             <w:tcW w:w="585" w:type="dxa"/>
+            <w:tcBorders>
+              <w:left w:val="single" w:sz="4" w:space="0" w:color="auto"/>
+              <w:right w:val="single" w:sz="4" w:space="0" w:color="auto"/>
+            </w:tcBorders>
           </w:tcPr>
           <w:p>
             <w:pPr>
@@ -942,6 +1151,10 @@
         <w:tc>
           <w:tcPr>
             <w:tcW w:w="585" w:type="dxa"/>
+            <w:tcBorders>
+              <w:left w:val="single" w:sz="4" w:space="0" w:color="auto"/>
+              <w:right w:val="single" w:sz="4" w:space="0" w:color="auto"/>
+            </w:tcBorders>
           </w:tcPr>
           <w:p>
             <w:pPr>
@@ -955,6 +1168,10 @@
         <w:tc>
           <w:tcPr>
             <w:tcW w:w="585" w:type="dxa"/>
+            <w:tcBorders>
+              <w:left w:val="single" w:sz="4" w:space="0" w:color="auto"/>
+              <w:right w:val="single" w:sz="4" w:space="0" w:color="auto"/>
+            </w:tcBorders>
           </w:tcPr>
           <w:p>
             <w:pPr>
@@ -968,6 +1185,9 @@
         <w:tc>
           <w:tcPr>
             <w:tcW w:w="585" w:type="dxa"/>
+            <w:tcBorders>
+              <w:left w:val="single" w:sz="4" w:space="0" w:color="auto"/>
+            </w:tcBorders>
           </w:tcPr>
           <w:p>
             <w:pPr>
@@ -983,6 +1203,7 @@
             <w:tcW w:w="585" w:type="dxa"/>
             <w:tcBorders>
               <w:left w:val="single" w:sz="24" w:space="0" w:color="000000"/>
+              <w:right w:val="single" w:sz="4" w:space="0" w:color="auto"/>
             </w:tcBorders>
           </w:tcPr>
           <w:p>
@@ -997,6 +1218,10 @@
         <w:tc>
           <w:tcPr>
             <w:tcW w:w="585" w:type="dxa"/>
+            <w:tcBorders>
+              <w:left w:val="single" w:sz="4" w:space="0" w:color="auto"/>
+              <w:right w:val="single" w:sz="4" w:space="0" w:color="auto"/>
+            </w:tcBorders>
           </w:tcPr>
           <w:p>
             <w:pPr>
@@ -1010,6 +1235,10 @@
         <w:tc>
           <w:tcPr>
             <w:tcW w:w="585" w:type="dxa"/>
+            <w:tcBorders>
+              <w:left w:val="single" w:sz="4" w:space="0" w:color="auto"/>
+              <w:right w:val="single" w:sz="4" w:space="0" w:color="auto"/>
+            </w:tcBorders>
           </w:tcPr>
           <w:p>
             <w:pPr>
@@ -1023,6 +1252,10 @@
         <w:tc>
           <w:tcPr>
             <w:tcW w:w="585" w:type="dxa"/>
+            <w:tcBorders>
+              <w:left w:val="single" w:sz="4" w:space="0" w:color="auto"/>
+              <w:right w:val="single" w:sz="4" w:space="0" w:color="auto"/>
+            </w:tcBorders>
           </w:tcPr>
           <w:p>
             <w:pPr>
@@ -1036,6 +1269,10 @@
         <w:tc>
           <w:tcPr>
             <w:tcW w:w="585" w:type="dxa"/>
+            <w:tcBorders>
+              <w:left w:val="single" w:sz="4" w:space="0" w:color="auto"/>
+              <w:right w:val="single" w:sz="4" w:space="0" w:color="auto"/>
+            </w:tcBorders>
           </w:tcPr>
           <w:p>
             <w:pPr>
@@ -1049,6 +1286,10 @@
         <w:tc>
           <w:tcPr>
             <w:tcW w:w="585" w:type="dxa"/>
+            <w:tcBorders>
+              <w:left w:val="single" w:sz="4" w:space="0" w:color="auto"/>
+              <w:right w:val="single" w:sz="4" w:space="0" w:color="auto"/>
+            </w:tcBorders>
           </w:tcPr>
           <w:p>
             <w:pPr>
@@ -1061,7 +1302,11 @@
         </w:tc>
         <w:tc>
           <w:tcPr>
-            <w:tcW w:w="585" w:type="dxa"/>
+            <w:tcW w:w="567" w:type="dxa"/>
+            <w:tcBorders>
+              <w:left w:val="single" w:sz="4" w:space="0" w:color="auto"/>
+              <w:right w:val="single" w:sz="4" w:space="0" w:color="auto"/>
+            </w:tcBorders>
           </w:tcPr>
           <w:p>
             <w:pPr>
@@ -1075,6 +1320,9 @@
         <w:tc>
           <w:tcPr>
             <w:tcW w:w="585" w:type="dxa"/>
+            <w:tcBorders>
+              <w:left w:val="single" w:sz="4" w:space="0" w:color="auto"/>
+            </w:tcBorders>
           </w:tcPr>
           <w:p>
             <w:pPr>
@@ -1277,7 +1525,7 @@
         </w:tc>
         <w:tc>
           <w:tcPr>
-            <w:tcW w:w="585" w:type="dxa"/>
+            <w:tcW w:w="567" w:type="dxa"/>
           </w:tcPr>
           <w:p>
             <w:pPr>
@@ -1304,6 +1552,7 @@
       </w:tr>
       <w:tr>
         <w:trPr>
+          <w:trHeight w:val="340"/>
           <w:jc w:val="center"/>
         </w:trPr>
         <w:tc>
@@ -1451,47 +1700,17 @@
         </w:tc>
         <w:tc>
           <w:tcPr>
-            <w:tcW w:w="585" w:type="dxa"/>
-          </w:tcPr>
-          <w:p>
-            <w:pPr>
-              <w:jc w:val="center"/>
-            </w:pPr>
-          </w:p>
-        </w:tc>
-        <w:tc>
-          <w:tcPr>
-            <w:tcW w:w="585" w:type="dxa"/>
-          </w:tcPr>
-          <w:p>
-            <w:pPr>
-              <w:jc w:val="center"/>
-            </w:pPr>
-          </w:p>
-        </w:tc>
-      </w:tr>
-      <w:tr>
-        <w:trPr>
-          <w:jc w:val="center"/>
-        </w:trPr>
-        <w:tc>
-          <w:tcPr>
-            <w:tcW w:w="4680" w:type="dxa"/>
-            <w:gridSpan w:val="8"/>
-          </w:tcPr>
-          <w:p>
-            <w:pPr>
-              <w:jc w:val="center"/>
-            </w:pPr>
-          </w:p>
-        </w:tc>
-        <w:tc>
-          <w:tcPr>
-            <w:tcW w:w="4680" w:type="dxa"/>
-            <w:gridSpan w:val="8"/>
-            <w:tcBorders>
-              <w:left w:val="single" w:sz="24" w:space="0" w:color="000000"/>
-            </w:tcBorders>
+            <w:tcW w:w="567" w:type="dxa"/>
+          </w:tcPr>
+          <w:p>
+            <w:pPr>
+              <w:jc w:val="center"/>
+            </w:pPr>
+          </w:p>
+        </w:tc>
+        <w:tc>
+          <w:tcPr>
+            <w:tcW w:w="585" w:type="dxa"/>
           </w:tcPr>
           <w:p>
             <w:pPr>

</xml_diff>